<commit_message>
feat: enhance contact section with phone number and update metadata
</commit_message>
<xml_diff>
--- a/public/resume/resumeWORD.docx
+++ b/public/resume/resumeWORD.docx
@@ -77,31 +77,7 @@
           <w:sz w:val="22"/>
           <w:szCs w:val="22"/>
         </w:rPr>
-        <w:t>+88</w:t>
-      </w:r>
-      <w:r>
-        <w:rPr>
-          <w:rFonts w:ascii="Noto Serif" w:hAnsi="Noto Serif"/>
-          <w:b w:val="false"/>
-          <w:bCs w:val="false"/>
-          <w:i w:val="false"/>
-          <w:iCs w:val="false"/>
-          <w:sz w:val="22"/>
-          <w:szCs w:val="22"/>
-        </w:rPr>
-        <w:t xml:space="preserve">0 1540165110 </w:t>
-      </w:r>
-      <w:r>
-        <w:rPr>
-          <w:rFonts w:ascii="Noto Serif" w:hAnsi="Noto Serif"/>
-          <w:b w:val="false"/>
-          <w:bCs w:val="false"/>
-          <w:i w:val="false"/>
-          <w:iCs w:val="false"/>
-          <w:sz w:val="22"/>
-          <w:szCs w:val="22"/>
-        </w:rPr>
-        <w:t xml:space="preserve">| </w:t>
+        <w:t xml:space="preserve">+880 1540165110 | </w:t>
       </w:r>
       <w:hyperlink r:id="rId2">
         <w:r>
@@ -128,19 +104,7 @@
           <w:sz w:val="22"/>
           <w:szCs w:val="22"/>
         </w:rPr>
-        <w:t xml:space="preserve"> </w:t>
-      </w:r>
-      <w:r>
-        <w:rPr>
-          <w:rFonts w:ascii="Noto Serif" w:hAnsi="Noto Serif"/>
-          <w:b w:val="false"/>
-          <w:bCs w:val="false"/>
-          <w:i w:val="false"/>
-          <w:iCs w:val="false"/>
-          <w:sz w:val="22"/>
-          <w:szCs w:val="22"/>
-        </w:rPr>
-        <w:t xml:space="preserve">| </w:t>
+        <w:t xml:space="preserve"> | </w:t>
       </w:r>
       <w:hyperlink r:id="rId3" w:tgtFrame="_blank">
         <w:r>
@@ -154,7 +118,7 @@
             <w:sz w:val="22"/>
             <w:szCs w:val="22"/>
           </w:rPr>
-          <w:t>GitHub: xjarifx</w:t>
+          <w:t>GitHub</w:t>
         </w:r>
       </w:hyperlink>
       <w:r>
@@ -167,19 +131,7 @@
           <w:sz w:val="22"/>
           <w:szCs w:val="22"/>
         </w:rPr>
-        <w:t xml:space="preserve"> </w:t>
-      </w:r>
-      <w:r>
-        <w:rPr>
-          <w:rFonts w:ascii="Noto Serif" w:hAnsi="Noto Serif"/>
-          <w:b w:val="false"/>
-          <w:bCs w:val="false"/>
-          <w:i w:val="false"/>
-          <w:iCs w:val="false"/>
-          <w:sz w:val="22"/>
-          <w:szCs w:val="22"/>
-        </w:rPr>
-        <w:t xml:space="preserve">| </w:t>
+        <w:t xml:space="preserve"> | </w:t>
       </w:r>
       <w:hyperlink r:id="rId4" w:tgtFrame="_blank">
         <w:r>
@@ -193,358 +145,34 @@
             <w:sz w:val="22"/>
             <w:szCs w:val="22"/>
           </w:rPr>
-          <w:t>LinkedIn: xjarifx</w:t>
+          <w:t>LinkedIn</w:t>
         </w:r>
       </w:hyperlink>
-    </w:p>
-    <w:p>
-      <w:pPr>
-        <w:pStyle w:val="Heading3"/>
-        <w:bidi w:val="0"/>
-        <w:jc w:val="both"/>
-        <w:rPr>
-          <w:rFonts w:ascii="Noto Serif" w:hAnsi="Noto Serif"/>
-          <w:b/>
-          <w:bCs/>
-          <w:i w:val="false"/>
-          <w:i w:val="false"/>
-          <w:iCs w:val="false"/>
-          <w:sz w:val="24"/>
-          <w:szCs w:val="24"/>
-        </w:rPr>
-      </w:pPr>
-      <w:r>
-        <w:rPr>
-          <w:rFonts w:ascii="Noto Serif" w:hAnsi="Noto Serif"/>
-          <w:b/>
-          <w:bCs/>
-          <w:i w:val="false"/>
-          <w:iCs w:val="false"/>
-          <w:sz w:val="24"/>
-          <w:szCs w:val="24"/>
-        </w:rPr>
-        <w:t>PROFESSIONAL SUMMARY</w:t>
-      </w:r>
-    </w:p>
-    <w:p>
-      <w:pPr>
-        <w:pStyle w:val="BodyText"/>
-        <w:bidi w:val="0"/>
-        <w:jc w:val="both"/>
-        <w:rPr>
-          <w:rFonts w:ascii="Noto Serif" w:hAnsi="Noto Serif"/>
-          <w:b w:val="false"/>
-          <w:bCs w:val="false"/>
-          <w:i w:val="false"/>
-          <w:i w:val="false"/>
-          <w:iCs w:val="false"/>
-          <w:sz w:val="22"/>
-          <w:szCs w:val="22"/>
-        </w:rPr>
-      </w:pPr>
-      <w:r>
-        <w:rPr>
-          <w:rFonts w:ascii="Noto Serif" w:hAnsi="Noto Serif"/>
-          <w:b w:val="false"/>
-          <w:bCs w:val="false"/>
-          <w:i w:val="false"/>
-          <w:iCs w:val="false"/>
-          <w:sz w:val="22"/>
-          <w:szCs w:val="22"/>
-        </w:rPr>
-        <w:t>Fullstack Developer specializing in TypeScript (PERN/</w:t>
-      </w:r>
-      <w:r>
-        <w:rPr>
-          <w:rFonts w:ascii="Noto Serif" w:hAnsi="Noto Serif"/>
-          <w:b w:val="false"/>
-          <w:bCs w:val="false"/>
-          <w:i w:val="false"/>
-          <w:iCs w:val="false"/>
-          <w:sz w:val="22"/>
-          <w:szCs w:val="22"/>
-        </w:rPr>
-        <w:t>MERN</w:t>
-      </w:r>
-      <w:r>
-        <w:rPr>
-          <w:rFonts w:ascii="Noto Serif" w:hAnsi="Noto Serif"/>
-          <w:b w:val="false"/>
-          <w:bCs w:val="false"/>
-          <w:i w:val="false"/>
-          <w:iCs w:val="false"/>
-          <w:sz w:val="22"/>
-          <w:szCs w:val="22"/>
-        </w:rPr>
-        <w:t xml:space="preserve"> Stack) and AWS Cloud Foundations; focused on building scalable, secure, and responsive web applications.</w:t>
-      </w:r>
-    </w:p>
-    <w:p>
-      <w:pPr>
-        <w:pStyle w:val="Heading3"/>
-        <w:bidi w:val="0"/>
-        <w:jc w:val="both"/>
-        <w:rPr>
-          <w:rFonts w:ascii="Noto Serif" w:hAnsi="Noto Serif"/>
-          <w:b/>
-          <w:bCs/>
-          <w:i w:val="false"/>
-          <w:i w:val="false"/>
-          <w:iCs w:val="false"/>
-          <w:sz w:val="24"/>
-          <w:szCs w:val="24"/>
-        </w:rPr>
-      </w:pPr>
-      <w:r>
-        <w:rPr>
-          <w:rFonts w:ascii="Noto Serif" w:hAnsi="Noto Serif"/>
-          <w:b/>
-          <w:bCs/>
-          <w:i w:val="false"/>
-          <w:iCs w:val="false"/>
-          <w:sz w:val="24"/>
-          <w:szCs w:val="24"/>
-        </w:rPr>
-        <w:t>TECHNICAL SKILLS</w:t>
-      </w:r>
-    </w:p>
-    <w:p>
-      <w:pPr>
-        <w:pStyle w:val="BodyText"/>
-        <w:numPr>
-          <w:ilvl w:val="0"/>
-          <w:numId w:val="1"/>
-        </w:numPr>
-        <w:tabs>
-          <w:tab w:val="clear" w:pos="709"/>
-          <w:tab w:val="left" w:pos="709" w:leader="none"/>
-        </w:tabs>
-        <w:bidi w:val="0"/>
-        <w:ind w:hanging="283" w:start="709"/>
-        <w:jc w:val="both"/>
-        <w:rPr>
-          <w:rFonts w:ascii="Noto Serif" w:hAnsi="Noto Serif"/>
-          <w:b w:val="false"/>
-          <w:bCs w:val="false"/>
-          <w:i w:val="false"/>
-          <w:i w:val="false"/>
-          <w:iCs w:val="false"/>
-          <w:sz w:val="22"/>
-          <w:szCs w:val="22"/>
-        </w:rPr>
-      </w:pPr>
-      <w:r>
-        <w:rPr>
-          <w:rFonts w:ascii="Noto Serif" w:hAnsi="Noto Serif"/>
-          <w:b w:val="false"/>
-          <w:bCs w:val="false"/>
-          <w:i w:val="false"/>
-          <w:iCs w:val="false"/>
-          <w:sz w:val="22"/>
-          <w:szCs w:val="22"/>
-        </w:rPr>
-        <w:t>Languages: TypeScript, JavaScript (ES6+), SQL, HTML5, CSS3</w:t>
-      </w:r>
-    </w:p>
-    <w:p>
-      <w:pPr>
-        <w:pStyle w:val="BodyText"/>
-        <w:numPr>
-          <w:ilvl w:val="0"/>
-          <w:numId w:val="1"/>
-        </w:numPr>
-        <w:tabs>
-          <w:tab w:val="clear" w:pos="709"/>
-          <w:tab w:val="left" w:pos="709" w:leader="none"/>
-        </w:tabs>
-        <w:bidi w:val="0"/>
-        <w:ind w:hanging="283" w:start="709"/>
-        <w:jc w:val="both"/>
-        <w:rPr>
-          <w:rFonts w:ascii="Noto Serif" w:hAnsi="Noto Serif"/>
-          <w:b w:val="false"/>
-          <w:bCs w:val="false"/>
-          <w:i w:val="false"/>
-          <w:i w:val="false"/>
-          <w:iCs w:val="false"/>
-          <w:sz w:val="22"/>
-          <w:szCs w:val="22"/>
-        </w:rPr>
-      </w:pPr>
-      <w:r>
-        <w:rPr>
-          <w:rFonts w:ascii="Noto Serif" w:hAnsi="Noto Serif"/>
-          <w:b w:val="false"/>
-          <w:bCs w:val="false"/>
-          <w:i w:val="false"/>
-          <w:iCs w:val="false"/>
-          <w:sz w:val="22"/>
-          <w:szCs w:val="22"/>
-        </w:rPr>
-        <w:t>Frontend: React.js, Next.js, Tailwind CSS, Redux, Responsive Design</w:t>
-      </w:r>
-    </w:p>
-    <w:p>
-      <w:pPr>
-        <w:pStyle w:val="BodyText"/>
-        <w:numPr>
-          <w:ilvl w:val="0"/>
-          <w:numId w:val="1"/>
-        </w:numPr>
-        <w:tabs>
-          <w:tab w:val="clear" w:pos="709"/>
-          <w:tab w:val="left" w:pos="709" w:leader="none"/>
-        </w:tabs>
-        <w:bidi w:val="0"/>
-        <w:ind w:hanging="283" w:start="709"/>
-        <w:jc w:val="both"/>
-        <w:rPr>
-          <w:rFonts w:ascii="Noto Serif" w:hAnsi="Noto Serif"/>
-          <w:b w:val="false"/>
-          <w:bCs w:val="false"/>
-          <w:i w:val="false"/>
-          <w:i w:val="false"/>
-          <w:iCs w:val="false"/>
-          <w:sz w:val="22"/>
-          <w:szCs w:val="22"/>
-        </w:rPr>
-      </w:pPr>
-      <w:r>
-        <w:rPr>
-          <w:rFonts w:ascii="Noto Serif" w:hAnsi="Noto Serif"/>
-          <w:b w:val="false"/>
-          <w:bCs w:val="false"/>
-          <w:i w:val="false"/>
-          <w:iCs w:val="false"/>
-          <w:sz w:val="22"/>
-          <w:szCs w:val="22"/>
-        </w:rPr>
-        <w:t>Backend: Node.js, Express.js, RESTful APIs, JWT Authentication, Zod</w:t>
-      </w:r>
-    </w:p>
-    <w:p>
-      <w:pPr>
-        <w:pStyle w:val="BodyText"/>
-        <w:numPr>
-          <w:ilvl w:val="0"/>
-          <w:numId w:val="1"/>
-        </w:numPr>
-        <w:tabs>
-          <w:tab w:val="clear" w:pos="709"/>
-          <w:tab w:val="left" w:pos="709" w:leader="none"/>
-        </w:tabs>
-        <w:bidi w:val="0"/>
-        <w:ind w:hanging="283" w:start="709"/>
-        <w:jc w:val="both"/>
-        <w:rPr>
-          <w:rFonts w:ascii="Noto Serif" w:hAnsi="Noto Serif"/>
-          <w:b w:val="false"/>
-          <w:bCs w:val="false"/>
-          <w:i w:val="false"/>
-          <w:i w:val="false"/>
-          <w:iCs w:val="false"/>
-          <w:sz w:val="22"/>
-          <w:szCs w:val="22"/>
-        </w:rPr>
-      </w:pPr>
-      <w:r>
-        <w:rPr>
-          <w:rFonts w:ascii="Noto Serif" w:hAnsi="Noto Serif"/>
-          <w:b w:val="false"/>
-          <w:bCs w:val="false"/>
-          <w:i w:val="false"/>
-          <w:iCs w:val="false"/>
-          <w:sz w:val="22"/>
-          <w:szCs w:val="22"/>
-        </w:rPr>
-        <w:t>Databases: PostgreSQL, MongoDB, Prisma ORM, Redis</w:t>
-      </w:r>
-    </w:p>
-    <w:p>
-      <w:pPr>
-        <w:pStyle w:val="BodyText"/>
-        <w:numPr>
-          <w:ilvl w:val="0"/>
-          <w:numId w:val="1"/>
-        </w:numPr>
-        <w:tabs>
-          <w:tab w:val="clear" w:pos="709"/>
-          <w:tab w:val="left" w:pos="709" w:leader="none"/>
-        </w:tabs>
-        <w:bidi w:val="0"/>
-        <w:ind w:hanging="283" w:start="709"/>
-        <w:jc w:val="both"/>
-        <w:rPr>
-          <w:rFonts w:ascii="Noto Serif" w:hAnsi="Noto Serif"/>
-          <w:b w:val="false"/>
-          <w:bCs w:val="false"/>
-          <w:i w:val="false"/>
-          <w:i w:val="false"/>
-          <w:iCs w:val="false"/>
-          <w:sz w:val="22"/>
-          <w:szCs w:val="22"/>
-        </w:rPr>
-      </w:pPr>
-      <w:r>
-        <w:rPr>
-          <w:rFonts w:ascii="Noto Serif" w:hAnsi="Noto Serif"/>
-          <w:b w:val="false"/>
-          <w:bCs w:val="false"/>
-          <w:i w:val="false"/>
-          <w:iCs w:val="false"/>
-          <w:sz w:val="22"/>
-          <w:szCs w:val="22"/>
-        </w:rPr>
-        <w:t>Tools &amp; DevOps: AWS (Cloud Foundations), Git, Docker, Postman, Vercel, Render</w:t>
-      </w:r>
-    </w:p>
-    <w:p>
-      <w:pPr>
-        <w:pStyle w:val="Heading3"/>
-        <w:bidi w:val="0"/>
-        <w:jc w:val="both"/>
-        <w:rPr>
-          <w:rFonts w:ascii="Noto Serif" w:hAnsi="Noto Serif"/>
-          <w:b/>
-          <w:bCs/>
-          <w:i w:val="false"/>
-          <w:i w:val="false"/>
-          <w:iCs w:val="false"/>
-          <w:sz w:val="24"/>
-          <w:szCs w:val="24"/>
-        </w:rPr>
-      </w:pPr>
-      <w:r>
-        <w:rPr>
-          <w:rFonts w:ascii="Noto Serif" w:hAnsi="Noto Serif"/>
-          <w:b/>
-          <w:bCs/>
-          <w:i w:val="false"/>
-          <w:iCs w:val="false"/>
-          <w:sz w:val="24"/>
-          <w:szCs w:val="24"/>
-        </w:rPr>
-        <w:t>PROJECTS</w:t>
-      </w:r>
-    </w:p>
-    <w:p>
-      <w:pPr>
-        <w:pStyle w:val="Heading4"/>
-        <w:bidi w:val="0"/>
-        <w:jc w:val="both"/>
-        <w:rPr/>
-      </w:pPr>
-      <w:r>
-        <w:rPr>
-          <w:rFonts w:ascii="Noto Serif" w:hAnsi="Noto Serif"/>
-          <w:b w:val="false"/>
-          <w:bCs w:val="false"/>
-          <w:i w:val="false"/>
-          <w:iCs w:val="false"/>
-          <w:sz w:val="22"/>
-          <w:szCs w:val="22"/>
-        </w:rPr>
-        <w:t>[</w:t>
+      <w:r>
+        <w:rPr>
+          <w:rStyle w:val="Hyperlink"/>
+          <w:rFonts w:ascii="Noto Serif" w:hAnsi="Noto Serif"/>
+          <w:b w:val="false"/>
+          <w:bCs w:val="false"/>
+          <w:i w:val="false"/>
+          <w:iCs w:val="false"/>
+          <w:sz w:val="22"/>
+          <w:szCs w:val="22"/>
+        </w:rPr>
+        <w:t xml:space="preserve"> </w:t>
+      </w:r>
+      <w:r>
+        <w:rPr>
+          <w:rStyle w:val="Hyperlink"/>
+          <w:rFonts w:ascii="Noto Serif" w:hAnsi="Noto Serif"/>
+          <w:b w:val="false"/>
+          <w:bCs w:val="false"/>
+          <w:i w:val="false"/>
+          <w:iCs w:val="false"/>
+          <w:sz w:val="22"/>
+          <w:szCs w:val="22"/>
+        </w:rPr>
+        <w:t xml:space="preserve">| </w:t>
       </w:r>
       <w:hyperlink r:id="rId5">
         <w:r>
@@ -558,29 +186,331 @@
             <w:sz w:val="22"/>
             <w:szCs w:val="22"/>
           </w:rPr>
-          <w:t>Live Demo</w:t>
+          <w:t>Portfolio</w:t>
         </w:r>
       </w:hyperlink>
-      <w:r>
-        <w:rPr>
-          <w:rFonts w:ascii="Noto Serif" w:hAnsi="Noto Serif"/>
-          <w:b w:val="false"/>
-          <w:bCs w:val="false"/>
-          <w:i w:val="false"/>
-          <w:iCs w:val="false"/>
-          <w:sz w:val="22"/>
-          <w:szCs w:val="22"/>
-        </w:rPr>
-        <w:t>] [</w:t>
-      </w:r>
+    </w:p>
+    <w:p>
+      <w:pPr>
+        <w:pStyle w:val="Heading3"/>
+        <w:bidi w:val="0"/>
+        <w:jc w:val="both"/>
+        <w:rPr>
+          <w:rFonts w:ascii="Noto Serif" w:hAnsi="Noto Serif"/>
+          <w:b/>
+          <w:bCs/>
+          <w:i w:val="false"/>
+          <w:i w:val="false"/>
+          <w:iCs w:val="false"/>
+          <w:sz w:val="24"/>
+          <w:szCs w:val="24"/>
+        </w:rPr>
+      </w:pPr>
+      <w:r>
+        <w:rPr>
+          <w:rFonts w:ascii="Noto Serif" w:hAnsi="Noto Serif"/>
+          <w:b/>
+          <w:bCs/>
+          <w:i w:val="false"/>
+          <w:iCs w:val="false"/>
+          <w:sz w:val="24"/>
+          <w:szCs w:val="24"/>
+        </w:rPr>
+        <w:t>PROFESSIONAL SUMMARY</w:t>
+      </w:r>
+    </w:p>
+    <w:p>
+      <w:pPr>
+        <w:pStyle w:val="BodyText"/>
+        <w:bidi w:val="0"/>
+        <w:jc w:val="both"/>
+        <w:rPr>
+          <w:rFonts w:ascii="Noto Serif" w:hAnsi="Noto Serif"/>
+          <w:b w:val="false"/>
+          <w:bCs w:val="false"/>
+          <w:i w:val="false"/>
+          <w:i w:val="false"/>
+          <w:iCs w:val="false"/>
+          <w:sz w:val="22"/>
+          <w:szCs w:val="22"/>
+        </w:rPr>
+      </w:pPr>
+      <w:r>
+        <w:rPr>
+          <w:rFonts w:ascii="Noto Serif" w:hAnsi="Noto Serif"/>
+          <w:b w:val="false"/>
+          <w:bCs w:val="false"/>
+          <w:i w:val="false"/>
+          <w:iCs w:val="false"/>
+          <w:sz w:val="22"/>
+          <w:szCs w:val="22"/>
+        </w:rPr>
+        <w:t>Fullstack Developer specializing in TypeScript (PERN/MERN Stack) and AWS Cloud Foundations; focused on building scalable, secure, and responsive web applications.</w:t>
+      </w:r>
+    </w:p>
+    <w:p>
+      <w:pPr>
+        <w:pStyle w:val="Heading3"/>
+        <w:bidi w:val="0"/>
+        <w:jc w:val="both"/>
+        <w:rPr>
+          <w:rFonts w:ascii="Noto Serif" w:hAnsi="Noto Serif"/>
+          <w:b/>
+          <w:bCs/>
+          <w:i w:val="false"/>
+          <w:i w:val="false"/>
+          <w:iCs w:val="false"/>
+          <w:sz w:val="24"/>
+          <w:szCs w:val="24"/>
+        </w:rPr>
+      </w:pPr>
+      <w:r>
+        <w:rPr>
+          <w:rFonts w:ascii="Noto Serif" w:hAnsi="Noto Serif"/>
+          <w:b/>
+          <w:bCs/>
+          <w:i w:val="false"/>
+          <w:iCs w:val="false"/>
+          <w:sz w:val="24"/>
+          <w:szCs w:val="24"/>
+        </w:rPr>
+        <w:t>TECHNICAL SKILLS</w:t>
+      </w:r>
+    </w:p>
+    <w:p>
+      <w:pPr>
+        <w:pStyle w:val="BodyText"/>
+        <w:numPr>
+          <w:ilvl w:val="0"/>
+          <w:numId w:val="1"/>
+        </w:numPr>
+        <w:tabs>
+          <w:tab w:val="left" w:pos="709" w:leader="none"/>
+        </w:tabs>
+        <w:bidi w:val="0"/>
+        <w:ind w:hanging="283" w:start="709"/>
+        <w:jc w:val="both"/>
+        <w:rPr>
+          <w:rFonts w:ascii="Noto Serif" w:hAnsi="Noto Serif"/>
+          <w:b w:val="false"/>
+          <w:bCs w:val="false"/>
+          <w:i w:val="false"/>
+          <w:i w:val="false"/>
+          <w:iCs w:val="false"/>
+          <w:sz w:val="22"/>
+          <w:szCs w:val="22"/>
+        </w:rPr>
+      </w:pPr>
+      <w:r>
+        <w:rPr>
+          <w:rFonts w:ascii="Noto Serif" w:hAnsi="Noto Serif"/>
+          <w:b w:val="false"/>
+          <w:bCs w:val="false"/>
+          <w:i w:val="false"/>
+          <w:iCs w:val="false"/>
+          <w:sz w:val="22"/>
+          <w:szCs w:val="22"/>
+        </w:rPr>
+        <w:t>Languages: TypeScript, JavaScript (ES6+), SQL, HTML5, CSS3</w:t>
+      </w:r>
+    </w:p>
+    <w:p>
+      <w:pPr>
+        <w:pStyle w:val="BodyText"/>
+        <w:numPr>
+          <w:ilvl w:val="0"/>
+          <w:numId w:val="1"/>
+        </w:numPr>
+        <w:tabs>
+          <w:tab w:val="left" w:pos="709" w:leader="none"/>
+        </w:tabs>
+        <w:bidi w:val="0"/>
+        <w:ind w:hanging="283" w:start="709"/>
+        <w:jc w:val="both"/>
+        <w:rPr>
+          <w:rFonts w:ascii="Noto Serif" w:hAnsi="Noto Serif"/>
+          <w:b w:val="false"/>
+          <w:bCs w:val="false"/>
+          <w:i w:val="false"/>
+          <w:i w:val="false"/>
+          <w:iCs w:val="false"/>
+          <w:sz w:val="22"/>
+          <w:szCs w:val="22"/>
+        </w:rPr>
+      </w:pPr>
+      <w:r>
+        <w:rPr>
+          <w:rFonts w:ascii="Noto Serif" w:hAnsi="Noto Serif"/>
+          <w:b w:val="false"/>
+          <w:bCs w:val="false"/>
+          <w:i w:val="false"/>
+          <w:iCs w:val="false"/>
+          <w:sz w:val="22"/>
+          <w:szCs w:val="22"/>
+        </w:rPr>
+        <w:t>Frontend: React.js, Next.js, Tailwind CSS, Redux, Responsive Design</w:t>
+      </w:r>
+    </w:p>
+    <w:p>
+      <w:pPr>
+        <w:pStyle w:val="BodyText"/>
+        <w:numPr>
+          <w:ilvl w:val="0"/>
+          <w:numId w:val="1"/>
+        </w:numPr>
+        <w:tabs>
+          <w:tab w:val="left" w:pos="709" w:leader="none"/>
+        </w:tabs>
+        <w:bidi w:val="0"/>
+        <w:ind w:hanging="283" w:start="709"/>
+        <w:jc w:val="both"/>
+        <w:rPr>
+          <w:rFonts w:ascii="Noto Serif" w:hAnsi="Noto Serif"/>
+          <w:b w:val="false"/>
+          <w:bCs w:val="false"/>
+          <w:i w:val="false"/>
+          <w:i w:val="false"/>
+          <w:iCs w:val="false"/>
+          <w:sz w:val="22"/>
+          <w:szCs w:val="22"/>
+        </w:rPr>
+      </w:pPr>
+      <w:r>
+        <w:rPr>
+          <w:rFonts w:ascii="Noto Serif" w:hAnsi="Noto Serif"/>
+          <w:b w:val="false"/>
+          <w:bCs w:val="false"/>
+          <w:i w:val="false"/>
+          <w:iCs w:val="false"/>
+          <w:sz w:val="22"/>
+          <w:szCs w:val="22"/>
+        </w:rPr>
+        <w:t>Backend: Node.js, Express.js, RESTful APIs, JWT Authentication, Zod</w:t>
+      </w:r>
+    </w:p>
+    <w:p>
+      <w:pPr>
+        <w:pStyle w:val="BodyText"/>
+        <w:numPr>
+          <w:ilvl w:val="0"/>
+          <w:numId w:val="1"/>
+        </w:numPr>
+        <w:tabs>
+          <w:tab w:val="left" w:pos="709" w:leader="none"/>
+        </w:tabs>
+        <w:bidi w:val="0"/>
+        <w:ind w:hanging="283" w:start="709"/>
+        <w:jc w:val="both"/>
+        <w:rPr>
+          <w:rFonts w:ascii="Noto Serif" w:hAnsi="Noto Serif"/>
+          <w:b w:val="false"/>
+          <w:bCs w:val="false"/>
+          <w:i w:val="false"/>
+          <w:i w:val="false"/>
+          <w:iCs w:val="false"/>
+          <w:sz w:val="22"/>
+          <w:szCs w:val="22"/>
+        </w:rPr>
+      </w:pPr>
+      <w:r>
+        <w:rPr>
+          <w:rFonts w:ascii="Noto Serif" w:hAnsi="Noto Serif"/>
+          <w:b w:val="false"/>
+          <w:bCs w:val="false"/>
+          <w:i w:val="false"/>
+          <w:iCs w:val="false"/>
+          <w:sz w:val="22"/>
+          <w:szCs w:val="22"/>
+        </w:rPr>
+        <w:t>Databases: PostgreSQL, MongoDB, Prisma ORM, Redis</w:t>
+      </w:r>
+    </w:p>
+    <w:p>
+      <w:pPr>
+        <w:pStyle w:val="BodyText"/>
+        <w:numPr>
+          <w:ilvl w:val="0"/>
+          <w:numId w:val="1"/>
+        </w:numPr>
+        <w:tabs>
+          <w:tab w:val="left" w:pos="709" w:leader="none"/>
+        </w:tabs>
+        <w:bidi w:val="0"/>
+        <w:ind w:hanging="283" w:start="709"/>
+        <w:jc w:val="both"/>
+        <w:rPr>
+          <w:rFonts w:ascii="Noto Serif" w:hAnsi="Noto Serif"/>
+          <w:b w:val="false"/>
+          <w:bCs w:val="false"/>
+          <w:i w:val="false"/>
+          <w:i w:val="false"/>
+          <w:iCs w:val="false"/>
+          <w:sz w:val="22"/>
+          <w:szCs w:val="22"/>
+        </w:rPr>
+      </w:pPr>
+      <w:r>
+        <w:rPr>
+          <w:rFonts w:ascii="Noto Serif" w:hAnsi="Noto Serif"/>
+          <w:b w:val="false"/>
+          <w:bCs w:val="false"/>
+          <w:i w:val="false"/>
+          <w:iCs w:val="false"/>
+          <w:sz w:val="22"/>
+          <w:szCs w:val="22"/>
+        </w:rPr>
+        <w:t>Tools &amp; DevOps: AWS (Cloud Foundations), Git, Docker, Postman, Vercel, Render</w:t>
+      </w:r>
+    </w:p>
+    <w:p>
+      <w:pPr>
+        <w:pStyle w:val="Heading3"/>
+        <w:bidi w:val="0"/>
+        <w:jc w:val="both"/>
+        <w:rPr>
+          <w:rFonts w:ascii="Noto Serif" w:hAnsi="Noto Serif"/>
+          <w:b/>
+          <w:bCs/>
+          <w:i w:val="false"/>
+          <w:i w:val="false"/>
+          <w:iCs w:val="false"/>
+          <w:sz w:val="24"/>
+          <w:szCs w:val="24"/>
+        </w:rPr>
+      </w:pPr>
+      <w:r>
+        <w:rPr>
+          <w:rFonts w:ascii="Noto Serif" w:hAnsi="Noto Serif"/>
+          <w:b/>
+          <w:bCs/>
+          <w:i w:val="false"/>
+          <w:iCs w:val="false"/>
+          <w:sz w:val="24"/>
+          <w:szCs w:val="24"/>
+        </w:rPr>
+        <w:t>PROJECTS</w:t>
+      </w:r>
+    </w:p>
+    <w:p>
+      <w:pPr>
+        <w:pStyle w:val="Heading4"/>
+        <w:bidi w:val="0"/>
+        <w:jc w:val="both"/>
+        <w:rPr/>
+      </w:pPr>
       <w:hyperlink r:id="rId6">
         <w:r>
           <w:rPr>
             <w:rStyle w:val="Hyperlink"/>
+            <w:rFonts w:ascii="Noto Serif" w:hAnsi="Noto Serif"/>
             <w:b w:val="false"/>
             <w:bCs w:val="false"/>
+            <w:i w:val="false"/>
+            <w:iCs w:val="false"/>
+            <w:sz w:val="22"/>
+            <w:szCs w:val="22"/>
           </w:rPr>
-          <w:t>Source Code</w:t>
+          <w:t>[Preview]</w:t>
         </w:r>
       </w:hyperlink>
       <w:r>
@@ -593,162 +523,7 @@
           <w:sz w:val="22"/>
           <w:szCs w:val="22"/>
         </w:rPr>
-        <w:t xml:space="preserve">] </w:t>
-      </w:r>
-      <w:r>
-        <w:rPr>
-          <w:rFonts w:ascii="Noto Serif" w:hAnsi="Noto Serif"/>
-          <w:b w:val="false"/>
-          <w:bCs w:val="false"/>
-          <w:i w:val="false"/>
-          <w:iCs w:val="false"/>
-          <w:sz w:val="22"/>
-          <w:szCs w:val="22"/>
-        </w:rPr>
-        <w:t>Full-Stack Social Media Platform</w:t>
-      </w:r>
-    </w:p>
-    <w:p>
-      <w:pPr>
-        <w:pStyle w:val="BodyText"/>
-        <w:numPr>
-          <w:ilvl w:val="0"/>
-          <w:numId w:val="2"/>
-        </w:numPr>
-        <w:tabs>
-          <w:tab w:val="clear" w:pos="709"/>
-          <w:tab w:val="left" w:pos="709" w:leader="none"/>
-        </w:tabs>
-        <w:bidi w:val="0"/>
-        <w:ind w:hanging="283" w:start="709"/>
-        <w:jc w:val="both"/>
-        <w:rPr>
-          <w:rFonts w:ascii="Noto Serif" w:hAnsi="Noto Serif"/>
-          <w:b w:val="false"/>
-          <w:bCs w:val="false"/>
-          <w:i w:val="false"/>
-          <w:i w:val="false"/>
-          <w:iCs w:val="false"/>
-          <w:sz w:val="22"/>
-          <w:szCs w:val="22"/>
-        </w:rPr>
-      </w:pPr>
-      <w:r>
-        <w:rPr>
-          <w:rFonts w:ascii="Noto Serif" w:hAnsi="Noto Serif"/>
-          <w:b w:val="false"/>
-          <w:bCs w:val="false"/>
-          <w:i w:val="false"/>
-          <w:iCs w:val="false"/>
-          <w:sz w:val="22"/>
-          <w:szCs w:val="22"/>
-        </w:rPr>
-        <w:t>Developed a feature-rich social networking application with real-time user interaction and secure authentication.</w:t>
-      </w:r>
-    </w:p>
-    <w:p>
-      <w:pPr>
-        <w:pStyle w:val="BodyText"/>
-        <w:numPr>
-          <w:ilvl w:val="0"/>
-          <w:numId w:val="2"/>
-        </w:numPr>
-        <w:tabs>
-          <w:tab w:val="clear" w:pos="709"/>
-          <w:tab w:val="left" w:pos="709" w:leader="none"/>
-        </w:tabs>
-        <w:bidi w:val="0"/>
-        <w:ind w:hanging="283" w:start="709"/>
-        <w:jc w:val="both"/>
-        <w:rPr>
-          <w:rFonts w:ascii="Noto Serif" w:hAnsi="Noto Serif"/>
-          <w:b w:val="false"/>
-          <w:bCs w:val="false"/>
-          <w:i w:val="false"/>
-          <w:i w:val="false"/>
-          <w:iCs w:val="false"/>
-          <w:sz w:val="22"/>
-          <w:szCs w:val="22"/>
-        </w:rPr>
-      </w:pPr>
-      <w:r>
-        <w:rPr>
-          <w:rFonts w:ascii="Noto Serif" w:hAnsi="Noto Serif"/>
-          <w:b w:val="false"/>
-          <w:bCs w:val="false"/>
-          <w:i w:val="false"/>
-          <w:iCs w:val="false"/>
-          <w:sz w:val="22"/>
-          <w:szCs w:val="22"/>
-        </w:rPr>
-        <w:t>Implemented JWT-based authentication and secure password hashing for user data protection.</w:t>
-      </w:r>
-    </w:p>
-    <w:p>
-      <w:pPr>
-        <w:pStyle w:val="BodyText"/>
-        <w:numPr>
-          <w:ilvl w:val="0"/>
-          <w:numId w:val="2"/>
-        </w:numPr>
-        <w:tabs>
-          <w:tab w:val="clear" w:pos="709"/>
-          <w:tab w:val="left" w:pos="709" w:leader="none"/>
-        </w:tabs>
-        <w:bidi w:val="0"/>
-        <w:ind w:hanging="283" w:start="709"/>
-        <w:jc w:val="both"/>
-        <w:rPr>
-          <w:rFonts w:ascii="Noto Serif" w:hAnsi="Noto Serif"/>
-          <w:b w:val="false"/>
-          <w:bCs w:val="false"/>
-          <w:i w:val="false"/>
-          <w:i w:val="false"/>
-          <w:iCs w:val="false"/>
-          <w:sz w:val="22"/>
-          <w:szCs w:val="22"/>
-        </w:rPr>
-      </w:pPr>
-      <w:r>
-        <w:rPr>
-          <w:rFonts w:ascii="Noto Serif" w:hAnsi="Noto Serif"/>
-          <w:b w:val="false"/>
-          <w:bCs w:val="false"/>
-          <w:i w:val="false"/>
-          <w:iCs w:val="false"/>
-          <w:sz w:val="22"/>
-          <w:szCs w:val="22"/>
-        </w:rPr>
-        <w:t>Designed a responsive UI using Tailwind CSS, ensuring a seamless experience across mobile and desktop devices.</w:t>
-      </w:r>
-    </w:p>
-    <w:p>
-      <w:pPr>
-        <w:pStyle w:val="Heading4"/>
-        <w:bidi w:val="0"/>
-        <w:jc w:val="both"/>
-        <w:rPr>
-          <w:rFonts w:ascii="Noto Serif" w:hAnsi="Noto Serif"/>
-          <w:b w:val="false"/>
-          <w:bCs w:val="false"/>
-          <w:i w:val="false"/>
-          <w:i w:val="false"/>
-          <w:iCs w:val="false"/>
-          <w:sz w:val="22"/>
-          <w:szCs w:val="22"/>
-        </w:rPr>
-      </w:pPr>
-      <w:r>
-        <w:rPr>
-          <w:rFonts w:ascii="Noto Serif" w:hAnsi="Noto Serif"/>
-          <w:b w:val="false"/>
-          <w:bCs w:val="false"/>
-          <w:i w:val="false"/>
-          <w:iCs w:val="false"/>
-          <w:sz w:val="22"/>
-          <w:szCs w:val="22"/>
-        </w:rPr>
-        <w:t>[</w:t>
+        <w:t xml:space="preserve"> </w:t>
       </w:r>
       <w:hyperlink r:id="rId7">
         <w:r>
@@ -762,22 +537,8 @@
             <w:sz w:val="22"/>
             <w:szCs w:val="22"/>
           </w:rPr>
-          <w:t>Live Demo</w:t>
+          <w:t>[</w:t>
         </w:r>
-      </w:hyperlink>
-      <w:r>
-        <w:rPr>
-          <w:rFonts w:ascii="Noto Serif" w:hAnsi="Noto Serif"/>
-          <w:b w:val="false"/>
-          <w:bCs w:val="false"/>
-          <w:i w:val="false"/>
-          <w:iCs w:val="false"/>
-          <w:sz w:val="22"/>
-          <w:szCs w:val="22"/>
-        </w:rPr>
-        <w:t>] [</w:t>
-      </w:r>
-      <w:hyperlink r:id="rId8">
         <w:r>
           <w:rPr>
             <w:rStyle w:val="Hyperlink"/>
@@ -791,6 +552,19 @@
           </w:rPr>
           <w:t>Source Code</w:t>
         </w:r>
+        <w:r>
+          <w:rPr>
+            <w:rStyle w:val="Hyperlink"/>
+            <w:rFonts w:ascii="Noto Serif" w:hAnsi="Noto Serif"/>
+            <w:b w:val="false"/>
+            <w:bCs w:val="false"/>
+            <w:i w:val="false"/>
+            <w:iCs w:val="false"/>
+            <w:sz w:val="22"/>
+            <w:szCs w:val="22"/>
+          </w:rPr>
+          <w:t>]</w:t>
+        </w:r>
       </w:hyperlink>
       <w:r>
         <w:rPr>
@@ -802,19 +576,227 @@
           <w:sz w:val="22"/>
           <w:szCs w:val="22"/>
         </w:rPr>
-        <w:t xml:space="preserve">] </w:t>
-      </w:r>
-      <w:r>
-        <w:rPr>
-          <w:rFonts w:ascii="Noto Serif" w:hAnsi="Noto Serif"/>
-          <w:b w:val="false"/>
-          <w:bCs w:val="false"/>
-          <w:i w:val="false"/>
-          <w:iCs w:val="false"/>
-          <w:sz w:val="22"/>
-          <w:szCs w:val="22"/>
-        </w:rPr>
-        <w:t>Flower Shop E-Commerce</w:t>
+        <w:t xml:space="preserve"> Social </w:t>
+      </w:r>
+      <w:r>
+        <w:rPr>
+          <w:rFonts w:ascii="Noto Serif" w:hAnsi="Noto Serif"/>
+          <w:b w:val="false"/>
+          <w:bCs w:val="false"/>
+          <w:i w:val="false"/>
+          <w:iCs w:val="false"/>
+          <w:sz w:val="22"/>
+          <w:szCs w:val="22"/>
+        </w:rPr>
+        <w:t>Network</w:t>
+      </w:r>
+    </w:p>
+    <w:p>
+      <w:pPr>
+        <w:pStyle w:val="BodyText"/>
+        <w:numPr>
+          <w:ilvl w:val="0"/>
+          <w:numId w:val="2"/>
+        </w:numPr>
+        <w:tabs>
+          <w:tab w:val="left" w:pos="709" w:leader="none"/>
+        </w:tabs>
+        <w:bidi w:val="0"/>
+        <w:ind w:hanging="283" w:start="709"/>
+        <w:jc w:val="both"/>
+        <w:rPr>
+          <w:rFonts w:ascii="Noto Serif" w:hAnsi="Noto Serif"/>
+          <w:b w:val="false"/>
+          <w:bCs w:val="false"/>
+          <w:i w:val="false"/>
+          <w:i w:val="false"/>
+          <w:iCs w:val="false"/>
+          <w:sz w:val="22"/>
+          <w:szCs w:val="22"/>
+        </w:rPr>
+      </w:pPr>
+      <w:r>
+        <w:rPr>
+          <w:rFonts w:ascii="Noto Serif" w:hAnsi="Noto Serif"/>
+          <w:b w:val="false"/>
+          <w:bCs w:val="false"/>
+          <w:i w:val="false"/>
+          <w:iCs w:val="false"/>
+          <w:sz w:val="22"/>
+          <w:szCs w:val="22"/>
+        </w:rPr>
+        <w:t>Developed a feature-rich social networking application with real-time user interaction and secure authentication.</w:t>
+      </w:r>
+    </w:p>
+    <w:p>
+      <w:pPr>
+        <w:pStyle w:val="BodyText"/>
+        <w:numPr>
+          <w:ilvl w:val="0"/>
+          <w:numId w:val="2"/>
+        </w:numPr>
+        <w:tabs>
+          <w:tab w:val="left" w:pos="709" w:leader="none"/>
+        </w:tabs>
+        <w:bidi w:val="0"/>
+        <w:ind w:hanging="283" w:start="709"/>
+        <w:jc w:val="both"/>
+        <w:rPr>
+          <w:rFonts w:ascii="Noto Serif" w:hAnsi="Noto Serif"/>
+          <w:b w:val="false"/>
+          <w:bCs w:val="false"/>
+          <w:i w:val="false"/>
+          <w:i w:val="false"/>
+          <w:iCs w:val="false"/>
+          <w:sz w:val="22"/>
+          <w:szCs w:val="22"/>
+        </w:rPr>
+      </w:pPr>
+      <w:r>
+        <w:rPr>
+          <w:rFonts w:ascii="Noto Serif" w:hAnsi="Noto Serif"/>
+          <w:b w:val="false"/>
+          <w:bCs w:val="false"/>
+          <w:i w:val="false"/>
+          <w:iCs w:val="false"/>
+          <w:sz w:val="22"/>
+          <w:szCs w:val="22"/>
+        </w:rPr>
+        <w:t>Implemented JWT-based authentication and secure password hashing for user data protection.</w:t>
+      </w:r>
+    </w:p>
+    <w:p>
+      <w:pPr>
+        <w:pStyle w:val="BodyText"/>
+        <w:numPr>
+          <w:ilvl w:val="0"/>
+          <w:numId w:val="2"/>
+        </w:numPr>
+        <w:tabs>
+          <w:tab w:val="left" w:pos="709" w:leader="none"/>
+        </w:tabs>
+        <w:bidi w:val="0"/>
+        <w:ind w:hanging="283" w:start="709"/>
+        <w:jc w:val="both"/>
+        <w:rPr>
+          <w:rFonts w:ascii="Noto Serif" w:hAnsi="Noto Serif"/>
+          <w:b w:val="false"/>
+          <w:bCs w:val="false"/>
+          <w:i w:val="false"/>
+          <w:i w:val="false"/>
+          <w:iCs w:val="false"/>
+          <w:sz w:val="22"/>
+          <w:szCs w:val="22"/>
+        </w:rPr>
+      </w:pPr>
+      <w:r>
+        <w:rPr>
+          <w:rFonts w:ascii="Noto Serif" w:hAnsi="Noto Serif"/>
+          <w:b w:val="false"/>
+          <w:bCs w:val="false"/>
+          <w:i w:val="false"/>
+          <w:iCs w:val="false"/>
+          <w:sz w:val="22"/>
+          <w:szCs w:val="22"/>
+        </w:rPr>
+        <w:t>Designed a responsive UI using Tailwind CSS, ensuring a seamless experience across mobile and desktop devices.</w:t>
+      </w:r>
+    </w:p>
+    <w:p>
+      <w:pPr>
+        <w:pStyle w:val="Heading4"/>
+        <w:bidi w:val="0"/>
+        <w:jc w:val="both"/>
+        <w:rPr>
+          <w:rFonts w:ascii="Noto Serif" w:hAnsi="Noto Serif"/>
+          <w:b w:val="false"/>
+          <w:bCs w:val="false"/>
+          <w:i w:val="false"/>
+          <w:i w:val="false"/>
+          <w:iCs w:val="false"/>
+          <w:sz w:val="22"/>
+          <w:szCs w:val="22"/>
+        </w:rPr>
+      </w:pPr>
+      <w:hyperlink r:id="rId8">
+        <w:r>
+          <w:rPr>
+            <w:rStyle w:val="Hyperlink"/>
+            <w:rFonts w:ascii="Noto Serif" w:hAnsi="Noto Serif"/>
+            <w:b w:val="false"/>
+            <w:bCs w:val="false"/>
+            <w:i w:val="false"/>
+            <w:iCs w:val="false"/>
+            <w:sz w:val="22"/>
+            <w:szCs w:val="22"/>
+          </w:rPr>
+          <w:t>[Preview]</w:t>
+        </w:r>
+      </w:hyperlink>
+      <w:r>
+        <w:rPr>
+          <w:rFonts w:ascii="Noto Serif" w:hAnsi="Noto Serif"/>
+          <w:b w:val="false"/>
+          <w:bCs w:val="false"/>
+          <w:i w:val="false"/>
+          <w:iCs w:val="false"/>
+          <w:sz w:val="22"/>
+          <w:szCs w:val="22"/>
+        </w:rPr>
+        <w:t xml:space="preserve"> </w:t>
+      </w:r>
+      <w:hyperlink r:id="rId9">
+        <w:r>
+          <w:rPr>
+            <w:rStyle w:val="Hyperlink"/>
+            <w:rFonts w:ascii="Noto Serif" w:hAnsi="Noto Serif"/>
+            <w:b w:val="false"/>
+            <w:bCs w:val="false"/>
+            <w:i w:val="false"/>
+            <w:iCs w:val="false"/>
+            <w:sz w:val="22"/>
+            <w:szCs w:val="22"/>
+          </w:rPr>
+          <w:t>[</w:t>
+        </w:r>
+        <w:r>
+          <w:rPr>
+            <w:rStyle w:val="Hyperlink"/>
+            <w:rFonts w:ascii="Noto Serif" w:hAnsi="Noto Serif"/>
+            <w:b w:val="false"/>
+            <w:bCs w:val="false"/>
+            <w:i w:val="false"/>
+            <w:iCs w:val="false"/>
+            <w:sz w:val="22"/>
+            <w:szCs w:val="22"/>
+          </w:rPr>
+          <w:t>Source Code</w:t>
+        </w:r>
+        <w:r>
+          <w:rPr>
+            <w:rStyle w:val="Hyperlink"/>
+            <w:rFonts w:ascii="Noto Serif" w:hAnsi="Noto Serif"/>
+            <w:b w:val="false"/>
+            <w:bCs w:val="false"/>
+            <w:i w:val="false"/>
+            <w:iCs w:val="false"/>
+            <w:sz w:val="22"/>
+            <w:szCs w:val="22"/>
+          </w:rPr>
+          <w:t>]</w:t>
+        </w:r>
+      </w:hyperlink>
+      <w:r>
+        <w:rPr>
+          <w:rFonts w:ascii="Noto Serif" w:hAnsi="Noto Serif"/>
+          <w:b w:val="false"/>
+          <w:bCs w:val="false"/>
+          <w:i w:val="false"/>
+          <w:iCs w:val="false"/>
+          <w:sz w:val="22"/>
+          <w:szCs w:val="22"/>
+        </w:rPr>
+        <w:t xml:space="preserve"> Flower Shop E-Commerce</w:t>
       </w:r>
     </w:p>
     <w:p>
@@ -825,7 +807,6 @@
           <w:numId w:val="3"/>
         </w:numPr>
         <w:tabs>
-          <w:tab w:val="clear" w:pos="709"/>
           <w:tab w:val="left" w:pos="709" w:leader="none"/>
         </w:tabs>
         <w:bidi w:val="0"/>
@@ -863,7 +844,6 @@
           <w:numId w:val="3"/>
         </w:numPr>
         <w:tabs>
-          <w:tab w:val="clear" w:pos="709"/>
           <w:tab w:val="left" w:pos="709" w:leader="none"/>
         </w:tabs>
         <w:bidi w:val="0"/>
@@ -930,7 +910,6 @@
           <w:numId w:val="4"/>
         </w:numPr>
         <w:tabs>
-          <w:tab w:val="clear" w:pos="709"/>
           <w:tab w:val="left" w:pos="709" w:leader="none"/>
         </w:tabs>
         <w:bidi w:val="0"/>
@@ -986,19 +965,7 @@
           <w:sz w:val="24"/>
           <w:szCs w:val="24"/>
         </w:rPr>
-        <w:t>E</w:t>
-      </w:r>
-      <w:r>
-        <w:rPr>
-          <w:rFonts w:ascii="Noto Serif" w:hAnsi="Noto Serif"/>
-          <w:b/>
-          <w:bCs/>
-          <w:i w:val="false"/>
-          <w:iCs w:val="false"/>
-          <w:sz w:val="24"/>
-          <w:szCs w:val="24"/>
-        </w:rPr>
-        <w:t>DUCATION</w:t>
+        <w:t>EDUCATION</w:t>
       </w:r>
     </w:p>
     <w:p>
@@ -1086,40 +1053,17 @@
           <w:sz w:val="22"/>
           <w:szCs w:val="22"/>
         </w:rPr>
-        <w:t>CGPA: 3.1</w:t>
-      </w:r>
-      <w:r>
-        <w:rPr>
-          <w:rFonts w:ascii="Noto Serif" w:hAnsi="Noto Serif"/>
-          <w:b w:val="false"/>
-          <w:bCs w:val="false"/>
-          <w:i w:val="false"/>
-          <w:iCs w:val="false"/>
-          <w:sz w:val="22"/>
-          <w:szCs w:val="22"/>
-        </w:rPr>
-        <w:t>+</w:t>
-      </w:r>
-      <w:r>
-        <w:rPr>
-          <w:rFonts w:ascii="Noto Serif" w:hAnsi="Noto Serif"/>
-          <w:b w:val="false"/>
-          <w:bCs w:val="false"/>
-          <w:i w:val="false"/>
-          <w:iCs w:val="false"/>
-          <w:sz w:val="22"/>
-          <w:szCs w:val="22"/>
-        </w:rPr>
-        <w:t>/4.0</w:t>
+        <w:t>CGPA: 3.1+/4.0</w:t>
       </w:r>
     </w:p>
     <w:sectPr>
       <w:type w:val="nextPage"/>
-      <w:pgSz w:w="11909" w:h="16834"/>
+      <w:pgSz w:w="11906" w:h="16838"/>
       <w:pgMar w:left="576" w:right="576" w:gutter="0" w:header="0" w:top="576" w:footer="0" w:bottom="576"/>
       <w:pgNumType w:fmt="decimal"/>
       <w:formProt w:val="false"/>
       <w:textDirection w:val="lrTb"/>
+      <w:docGrid w:type="default" w:linePitch="100" w:charSpace="0"/>
     </w:sectPr>
   </w:body>
 </w:document>
@@ -1678,7 +1622,6 @@
   <w:abstractNum w:abstractNumId="5">
     <w:lvl w:ilvl="0">
       <w:start w:val="1"/>
-      <w:pStyle w:val="Heading1"/>
       <w:numFmt w:val="none"/>
       <w:suff w:val="nothing"/>
       <w:lvlText w:val=""/>
@@ -1705,7 +1648,6 @@
     </w:lvl>
     <w:lvl w:ilvl="2">
       <w:start w:val="1"/>
-      <w:pStyle w:val="Heading3"/>
       <w:numFmt w:val="none"/>
       <w:suff w:val="nothing"/>
       <w:lvlText w:val=""/>
@@ -1719,7 +1661,6 @@
     </w:lvl>
     <w:lvl w:ilvl="3">
       <w:start w:val="1"/>
-      <w:pStyle w:val="Heading4"/>
       <w:numFmt w:val="none"/>
       <w:suff w:val="nothing"/>
       <w:lvlText w:val=""/>
@@ -1829,7 +1770,6 @@
     </w:rPrDefault>
     <w:pPrDefault>
       <w:pPr>
-        <w:widowControl/>
         <w:suppressAutoHyphens w:val="true"/>
       </w:pPr>
     </w:pPrDefault>
@@ -1839,7 +1779,10 @@
     <w:qFormat/>
     <w:pPr>
       <w:widowControl/>
+      <w:suppressAutoHyphens w:val="true"/>
       <w:bidi w:val="0"/>
+      <w:spacing w:before="0" w:after="0"/>
+      <w:jc w:val="start"/>
     </w:pPr>
     <w:rPr>
       <w:rFonts w:ascii="Liberation Serif" w:hAnsi="Liberation Serif" w:eastAsia="Noto Serif CJK SC" w:cs="Noto Sans Devanagari"/>

</xml_diff>